<commit_message>
Added initial proposal submission
</commit_message>
<xml_diff>
--- a/Draft for Speed Project.docx
+++ b/Draft for Speed Project.docx
@@ -17,7 +17,7 @@
         <w:pStyle w:val="ListParagraph"/>
         <w:numPr>
           <w:ilvl w:val="0"/>
-          <w:numId w:val="2"/>
+          <w:numId w:val="7"/>
         </w:numPr>
       </w:pPr>
       <w:r>
@@ -41,7 +41,7 @@
         <w:pStyle w:val="ListParagraph"/>
         <w:numPr>
           <w:ilvl w:val="0"/>
-          <w:numId w:val="2"/>
+          <w:numId w:val="7"/>
         </w:numPr>
       </w:pPr>
       <w:r>
@@ -122,7 +122,7 @@
         <w:pStyle w:val="ListParagraph"/>
         <w:numPr>
           <w:ilvl w:val="0"/>
-          <w:numId w:val="2"/>
+          <w:numId w:val="7"/>
         </w:numPr>
       </w:pPr>
       <w:r>
@@ -137,7 +137,7 @@
         <w:pStyle w:val="ListParagraph"/>
         <w:numPr>
           <w:ilvl w:val="0"/>
-          <w:numId w:val="2"/>
+          <w:numId w:val="7"/>
         </w:numPr>
       </w:pPr>
       <w:r>
@@ -152,7 +152,7 @@
         <w:pStyle w:val="ListParagraph"/>
         <w:numPr>
           <w:ilvl w:val="0"/>
-          <w:numId w:val="2"/>
+          <w:numId w:val="7"/>
         </w:numPr>
       </w:pPr>
       <w:r>
@@ -172,7 +172,7 @@
         <w:pStyle w:val="ListParagraph"/>
         <w:numPr>
           <w:ilvl w:val="0"/>
-          <w:numId w:val="2"/>
+          <w:numId w:val="7"/>
         </w:numPr>
       </w:pPr>
       <w:r>
@@ -199,7 +199,7 @@
         <w:pStyle w:val="ListParagraph"/>
         <w:numPr>
           <w:ilvl w:val="0"/>
-          <w:numId w:val="2"/>
+          <w:numId w:val="7"/>
         </w:numPr>
       </w:pPr>
       <w:r>
@@ -211,7 +211,7 @@
         <w:pStyle w:val="ListParagraph"/>
         <w:numPr>
           <w:ilvl w:val="1"/>
-          <w:numId w:val="2"/>
+          <w:numId w:val="7"/>
         </w:numPr>
       </w:pPr>
       <w:r>
@@ -245,17 +245,14 @@
         <w:t>AND</w:t>
       </w:r>
       <w:r>
-        <w:t xml:space="preserve"> len(detected_exclusion_keywords) == 0.</w:t>
-      </w:r>
-      <w:r>
-        <w:t xml:space="preserve"> </w:t>
+        <w:t xml:space="preserve"> len(detected_exclusion_keywords) == 0. </w:t>
       </w:r>
     </w:p>
     <w:p>
       <w:pPr>
         <w:numPr>
           <w:ilvl w:val="1"/>
-          <w:numId w:val="2"/>
+          <w:numId w:val="7"/>
         </w:numPr>
         <w:spacing w:after="0" w:line="240" w:lineRule="auto"/>
         <w:textAlignment w:val="baseline"/>
@@ -322,7 +319,7 @@
         <w:pStyle w:val="ListParagraph"/>
         <w:numPr>
           <w:ilvl w:val="0"/>
-          <w:numId w:val="2"/>
+          <w:numId w:val="7"/>
         </w:numPr>
       </w:pPr>
       <w:r>
@@ -333,7 +330,7 @@
       <w:pPr>
         <w:numPr>
           <w:ilvl w:val="1"/>
-          <w:numId w:val="2"/>
+          <w:numId w:val="7"/>
         </w:numPr>
         <w:spacing w:after="0" w:line="240" w:lineRule="auto"/>
         <w:textAlignment w:val="baseline"/>
@@ -445,7 +442,7 @@
       <w:pPr>
         <w:numPr>
           <w:ilvl w:val="1"/>
-          <w:numId w:val="2"/>
+          <w:numId w:val="7"/>
         </w:numPr>
         <w:spacing w:after="0" w:line="240" w:lineRule="auto"/>
         <w:textAlignment w:val="baseline"/>
@@ -469,7 +466,6 @@
           <w:szCs w:val="22"/>
           <w14:ligatures w14:val="none"/>
         </w:rPr>
-        <w:lastRenderedPageBreak/>
         <w:t>Action:</w:t>
       </w:r>
       <w:r>
@@ -489,7 +485,7 @@
         <w:pStyle w:val="ListParagraph"/>
         <w:numPr>
           <w:ilvl w:val="0"/>
-          <w:numId w:val="2"/>
+          <w:numId w:val="7"/>
         </w:numPr>
       </w:pPr>
       <w:r>
@@ -501,7 +497,7 @@
         <w:pStyle w:val="ListParagraph"/>
         <w:numPr>
           <w:ilvl w:val="1"/>
-          <w:numId w:val="2"/>
+          <w:numId w:val="7"/>
         </w:numPr>
       </w:pPr>
       <w:r>
@@ -540,7 +536,7 @@
         <w:pStyle w:val="ListParagraph"/>
         <w:numPr>
           <w:ilvl w:val="1"/>
-          <w:numId w:val="2"/>
+          <w:numId w:val="7"/>
         </w:numPr>
       </w:pPr>
       <w:r>
@@ -559,7 +555,7 @@
         <w:pStyle w:val="ListParagraph"/>
         <w:numPr>
           <w:ilvl w:val="0"/>
-          <w:numId w:val="2"/>
+          <w:numId w:val="7"/>
         </w:numPr>
       </w:pPr>
       <w:r>
@@ -571,7 +567,7 @@
         <w:pStyle w:val="ListParagraph"/>
         <w:numPr>
           <w:ilvl w:val="1"/>
-          <w:numId w:val="2"/>
+          <w:numId w:val="7"/>
         </w:numPr>
       </w:pPr>
       <w:r>
@@ -600,7 +596,7 @@
         <w:pStyle w:val="ListParagraph"/>
         <w:numPr>
           <w:ilvl w:val="1"/>
-          <w:numId w:val="2"/>
+          <w:numId w:val="7"/>
         </w:numPr>
       </w:pPr>
       <w:r>
@@ -624,7 +620,7 @@
         <w:pStyle w:val="ListParagraph"/>
         <w:numPr>
           <w:ilvl w:val="0"/>
-          <w:numId w:val="2"/>
+          <w:numId w:val="7"/>
         </w:numPr>
       </w:pPr>
       <w:r>
@@ -662,7 +658,7 @@
       <w:pPr>
         <w:numPr>
           <w:ilvl w:val="0"/>
-          <w:numId w:val="1"/>
+          <w:numId w:val="5"/>
         </w:numPr>
       </w:pPr>
       <w:r>
@@ -673,7 +669,7 @@
       <w:pPr>
         <w:numPr>
           <w:ilvl w:val="0"/>
-          <w:numId w:val="1"/>
+          <w:numId w:val="5"/>
         </w:numPr>
       </w:pPr>
       <w:r>
@@ -684,7 +680,7 @@
       <w:pPr>
         <w:numPr>
           <w:ilvl w:val="0"/>
-          <w:numId w:val="1"/>
+          <w:numId w:val="5"/>
         </w:numPr>
       </w:pPr>
       <w:r>
@@ -1681,14 +1677,8 @@
       </w:rPr>
     </w:lvl>
   </w:abstractNum>
-  <w:num w:numId="1" w16cid:durableId="662776222">
-    <w:abstractNumId w:val="2"/>
-  </w:num>
-  <w:num w:numId="2" w16cid:durableId="820778381">
-    <w:abstractNumId w:val="5"/>
-  </w:num>
-  <w:num w:numId="3" w16cid:durableId="973874273">
-    <w:abstractNumId w:val="3"/>
+  <w:num w:numId="1" w16cid:durableId="1564833096">
+    <w:abstractNumId w:val="4"/>
     <w:lvlOverride w:ilvl="0">
       <w:lvl w:ilvl="0">
         <w:numFmt w:val="bullet"/>
@@ -1707,7 +1697,7 @@
       </w:lvl>
     </w:lvlOverride>
   </w:num>
-  <w:num w:numId="4" w16cid:durableId="939919161">
+  <w:num w:numId="2" w16cid:durableId="1655841088">
     <w:abstractNumId w:val="1"/>
     <w:lvlOverride w:ilvl="0">
       <w:lvl w:ilvl="0">
@@ -1727,7 +1717,7 @@
       </w:lvl>
     </w:lvlOverride>
   </w:num>
-  <w:num w:numId="5" w16cid:durableId="1655841088">
+  <w:num w:numId="3" w16cid:durableId="1731537207">
     <w:abstractNumId w:val="1"/>
     <w:lvlOverride w:ilvl="0">
       <w:lvl w:ilvl="0">
@@ -1747,7 +1737,93 @@
       </w:lvl>
     </w:lvlOverride>
   </w:num>
-  <w:num w:numId="6" w16cid:durableId="1731537207">
+  <w:num w:numId="4" w16cid:durableId="2090081719">
+    <w:abstractNumId w:val="6"/>
+    <w:lvlOverride w:ilvl="0">
+      <w:lvl w:ilvl="0">
+        <w:numFmt w:val="bullet"/>
+        <w:lvlText w:val=""/>
+        <w:lvlJc w:val="left"/>
+        <w:pPr>
+          <w:tabs>
+            <w:tab w:val="num" w:pos="720"/>
+          </w:tabs>
+          <w:ind w:left="720" w:hanging="360"/>
+        </w:pPr>
+        <w:rPr>
+          <w:rFonts w:ascii="Wingdings" w:hAnsi="Wingdings" w:hint="default"/>
+          <w:sz w:val="20"/>
+        </w:rPr>
+      </w:lvl>
+    </w:lvlOverride>
+  </w:num>
+  <w:num w:numId="5" w16cid:durableId="662776222">
+    <w:abstractNumId w:val="2"/>
+  </w:num>
+  <w:num w:numId="6" w16cid:durableId="819882238">
+    <w:abstractNumId w:val="0"/>
+    <w:lvlOverride w:ilvl="0">
+      <w:lvl w:ilvl="0">
+        <w:numFmt w:val="bullet"/>
+        <w:lvlText w:val=""/>
+        <w:lvlJc w:val="left"/>
+        <w:pPr>
+          <w:tabs>
+            <w:tab w:val="num" w:pos="720"/>
+          </w:tabs>
+          <w:ind w:left="720" w:hanging="360"/>
+        </w:pPr>
+        <w:rPr>
+          <w:rFonts w:ascii="Wingdings" w:hAnsi="Wingdings" w:hint="default"/>
+          <w:sz w:val="20"/>
+        </w:rPr>
+      </w:lvl>
+    </w:lvlOverride>
+  </w:num>
+  <w:num w:numId="7" w16cid:durableId="820778381">
+    <w:abstractNumId w:val="5"/>
+  </w:num>
+  <w:num w:numId="8" w16cid:durableId="879971049">
+    <w:abstractNumId w:val="4"/>
+    <w:lvlOverride w:ilvl="0">
+      <w:lvl w:ilvl="0">
+        <w:numFmt w:val="bullet"/>
+        <w:lvlText w:val=""/>
+        <w:lvlJc w:val="left"/>
+        <w:pPr>
+          <w:tabs>
+            <w:tab w:val="num" w:pos="720"/>
+          </w:tabs>
+          <w:ind w:left="720" w:hanging="360"/>
+        </w:pPr>
+        <w:rPr>
+          <w:rFonts w:ascii="Wingdings" w:hAnsi="Wingdings" w:hint="default"/>
+          <w:sz w:val="20"/>
+        </w:rPr>
+      </w:lvl>
+    </w:lvlOverride>
+  </w:num>
+  <w:num w:numId="9" w16cid:durableId="9335061">
+    <w:abstractNumId w:val="4"/>
+    <w:lvlOverride w:ilvl="0">
+      <w:lvl w:ilvl="0">
+        <w:numFmt w:val="bullet"/>
+        <w:lvlText w:val=""/>
+        <w:lvlJc w:val="left"/>
+        <w:pPr>
+          <w:tabs>
+            <w:tab w:val="num" w:pos="720"/>
+          </w:tabs>
+          <w:ind w:left="720" w:hanging="360"/>
+        </w:pPr>
+        <w:rPr>
+          <w:rFonts w:ascii="Wingdings" w:hAnsi="Wingdings" w:hint="default"/>
+          <w:sz w:val="20"/>
+        </w:rPr>
+      </w:lvl>
+    </w:lvlOverride>
+  </w:num>
+  <w:num w:numId="10" w16cid:durableId="939919161">
     <w:abstractNumId w:val="1"/>
     <w:lvlOverride w:ilvl="0">
       <w:lvl w:ilvl="0">
@@ -1767,88 +1843,8 @@
       </w:lvl>
     </w:lvlOverride>
   </w:num>
-  <w:num w:numId="7" w16cid:durableId="9335061">
-    <w:abstractNumId w:val="4"/>
-    <w:lvlOverride w:ilvl="0">
-      <w:lvl w:ilvl="0">
-        <w:numFmt w:val="bullet"/>
-        <w:lvlText w:val=""/>
-        <w:lvlJc w:val="left"/>
-        <w:pPr>
-          <w:tabs>
-            <w:tab w:val="num" w:pos="720"/>
-          </w:tabs>
-          <w:ind w:left="720" w:hanging="360"/>
-        </w:pPr>
-        <w:rPr>
-          <w:rFonts w:ascii="Wingdings" w:hAnsi="Wingdings" w:hint="default"/>
-          <w:sz w:val="20"/>
-        </w:rPr>
-      </w:lvl>
-    </w:lvlOverride>
-  </w:num>
-  <w:num w:numId="8" w16cid:durableId="1564833096">
-    <w:abstractNumId w:val="4"/>
-    <w:lvlOverride w:ilvl="0">
-      <w:lvl w:ilvl="0">
-        <w:numFmt w:val="bullet"/>
-        <w:lvlText w:val=""/>
-        <w:lvlJc w:val="left"/>
-        <w:pPr>
-          <w:tabs>
-            <w:tab w:val="num" w:pos="720"/>
-          </w:tabs>
-          <w:ind w:left="720" w:hanging="360"/>
-        </w:pPr>
-        <w:rPr>
-          <w:rFonts w:ascii="Wingdings" w:hAnsi="Wingdings" w:hint="default"/>
-          <w:sz w:val="20"/>
-        </w:rPr>
-      </w:lvl>
-    </w:lvlOverride>
-  </w:num>
-  <w:num w:numId="9" w16cid:durableId="879971049">
-    <w:abstractNumId w:val="4"/>
-    <w:lvlOverride w:ilvl="0">
-      <w:lvl w:ilvl="0">
-        <w:numFmt w:val="bullet"/>
-        <w:lvlText w:val=""/>
-        <w:lvlJc w:val="left"/>
-        <w:pPr>
-          <w:tabs>
-            <w:tab w:val="num" w:pos="720"/>
-          </w:tabs>
-          <w:ind w:left="720" w:hanging="360"/>
-        </w:pPr>
-        <w:rPr>
-          <w:rFonts w:ascii="Wingdings" w:hAnsi="Wingdings" w:hint="default"/>
-          <w:sz w:val="20"/>
-        </w:rPr>
-      </w:lvl>
-    </w:lvlOverride>
-  </w:num>
-  <w:num w:numId="10" w16cid:durableId="819882238">
-    <w:abstractNumId w:val="0"/>
-    <w:lvlOverride w:ilvl="0">
-      <w:lvl w:ilvl="0">
-        <w:numFmt w:val="bullet"/>
-        <w:lvlText w:val=""/>
-        <w:lvlJc w:val="left"/>
-        <w:pPr>
-          <w:tabs>
-            <w:tab w:val="num" w:pos="720"/>
-          </w:tabs>
-          <w:ind w:left="720" w:hanging="360"/>
-        </w:pPr>
-        <w:rPr>
-          <w:rFonts w:ascii="Wingdings" w:hAnsi="Wingdings" w:hint="default"/>
-          <w:sz w:val="20"/>
-        </w:rPr>
-      </w:lvl>
-    </w:lvlOverride>
-  </w:num>
-  <w:num w:numId="11" w16cid:durableId="2090081719">
-    <w:abstractNumId w:val="6"/>
+  <w:num w:numId="11" w16cid:durableId="973874273">
+    <w:abstractNumId w:val="3"/>
     <w:lvlOverride w:ilvl="0">
       <w:lvl w:ilvl="0">
         <w:numFmt w:val="bullet"/>
@@ -2473,6 +2469,7 @@
   <w:style w:type="character" w:default="1" w:styleId="DefaultParagraphFont">
     <w:name w:val="Default Paragraph Font"/>
     <w:uiPriority w:val="1"/>
+    <w:semiHidden/>
     <w:unhideWhenUsed/>
   </w:style>
   <w:style w:type="table" w:default="1" w:styleId="TableNormal">

</xml_diff>